<commit_message>
Explain architecture-specific model behavior
</commit_message>
<xml_diff>
--- a/submission/PranavJoshi_230953248_FGAI_Assignment2.docx
+++ b/submission/PranavJoshi_230953248_FGAI_Assignment2.docx
@@ -1539,6 +1539,44 @@
     <w:p>
       <w:r>
         <w:br w:type="page"/>
+      </w:r>
+    </w:p>
+    <w:p>
+      <w:pPr>
+        <w:pStyle w:val="Heading2"/>
+      </w:pPr>
+      <w:r>
+        <w:t>5 1 Architecture based interpretation</w:t>
+      </w:r>
+    </w:p>
+    <w:p>
+      <w:pPr/>
+      <w:r>
+        <w:t>The observed ranking is consistent with the models' memory mechanisms, but it does not prove that architecture alone caused every difference. The experiment used one seed, validation-based stopping produced unequal epoch counts, and GRU was still improving at epoch 40. The following explanations should therefore be read as mechanisms that fit the evidence rather than isolated causal effects.</w:t>
+      </w:r>
+    </w:p>
+    <w:p>
+      <w:pPr/>
+      <w:r>
+        <w:t>Simple RNN repeatedly compresses the 64-token history into one tanh hidden state. Older information and its gradients can decay over many recurrent steps, so the model can learn frequent local word transitions while struggling to retain cues across several limerick lines. Its relatively high perplexity and near-chance rhyme score are consistent with that limitation.</w:t>
+      </w:r>
+    </w:p>
+    <w:p>
+      <w:pPr/>
+      <w:r>
+        <w:t>BiRNN reads the same completed context window in both directions and concatenates two 256-unit states. It never sees the target word or future generated text, so the backward pass supplies another ordering of the existing past rather than the future context that usually makes bidirectional models useful. The concatenated state also doubles the input to the 10,000-word output projection, raising the parameter count and per-epoch cost. This explains why it was much more expensive than Simple RNN without gaining perplexity; the reverse state may also give less direct emphasis to the most recent tokens needed for autoregressive prediction and line termination.</w:t>
+      </w:r>
+    </w:p>
+    <w:p>
+      <w:pPr/>
+      <w:r>
+        <w:t>LSTM uses a cell state with input, forget, and output gates, providing a more stable route for information and gradients than a vanilla RNN. This mechanism is consistent with its lower perplexity and stronger blinded coherence scores. It does not, however, explicitly plan an AABBA rhyme scheme. Average next-word loss is dominated by common tokens, while rhyming line endings are sparse decisions separated by many steps, so better token prediction need not produce strong strict rhyme.</w:t>
+      </w:r>
+    </w:p>
+    <w:p>
+      <w:pPr/>
+      <w:r>
+        <w:t>GRU uses update and reset gates to retain useful history while adapting its candidate state, with no separate cell state and fewer parameters than this LSTM. Its simpler gated path may have been easier to optimise on this dataset and may have retained line-position and earlier-ending cues strongly enough to reproduce rhyme patterns. At low temperature, sampling repeatedly selects the most probable version of those learned patterns, which is consistent with GRU combining high rhyme with the highest repeated-trigram rate and repeated endings such as man at temperature 0.3. Raising the temperature to 0.5 reduces that over-concentration while preserving most of the rhyme score.</w:t>
       </w:r>
     </w:p>
     <w:p>

</xml_diff>